<commit_message>
Added Name box and changed colour scheme
</commit_message>
<xml_diff>
--- a/investmentjournal work log.docx
+++ b/investmentjournal work log.docx
@@ -525,130 +525,641 @@
           <w:tcPr>
             <w:tcW w:w="811" w:type="dxa"/>
           </w:tcPr>
-          <w:p/>
-        </w:tc>
-        <w:tc>
-          <w:tcPr>
-            <w:tcW w:w="1639" w:type="dxa"/>
-          </w:tcPr>
-          <w:p/>
-        </w:tc>
-        <w:tc>
-          <w:tcPr>
-            <w:tcW w:w="4496" w:type="dxa"/>
-          </w:tcPr>
-          <w:p>
-            <w:pPr>
-              <w:rPr>
-                <w:noProof/>
-              </w:rPr>
-            </w:pPr>
-          </w:p>
-        </w:tc>
-        <w:tc>
-          <w:tcPr>
-            <w:tcW w:w="4820" w:type="dxa"/>
-          </w:tcPr>
-          <w:p/>
-        </w:tc>
-        <w:tc>
-          <w:tcPr>
-            <w:tcW w:w="4536" w:type="dxa"/>
-          </w:tcPr>
-          <w:p>
-            <w:pPr>
-              <w:rPr>
-                <w:noProof/>
-              </w:rPr>
-            </w:pPr>
-          </w:p>
-        </w:tc>
-      </w:tr>
-      <w:tr>
-        <w:tc>
-          <w:tcPr>
-            <w:tcW w:w="811" w:type="dxa"/>
-          </w:tcPr>
-          <w:p/>
-        </w:tc>
-        <w:tc>
-          <w:tcPr>
-            <w:tcW w:w="1639" w:type="dxa"/>
-          </w:tcPr>
-          <w:p/>
-        </w:tc>
-        <w:tc>
-          <w:tcPr>
-            <w:tcW w:w="4496" w:type="dxa"/>
-          </w:tcPr>
-          <w:p>
-            <w:pPr>
-              <w:rPr>
-                <w:noProof/>
-              </w:rPr>
-            </w:pPr>
-          </w:p>
-        </w:tc>
-        <w:tc>
-          <w:tcPr>
-            <w:tcW w:w="4820" w:type="dxa"/>
-          </w:tcPr>
-          <w:p/>
-        </w:tc>
-        <w:tc>
-          <w:tcPr>
-            <w:tcW w:w="4536" w:type="dxa"/>
-          </w:tcPr>
-          <w:p>
-            <w:pPr>
-              <w:rPr>
-                <w:noProof/>
-              </w:rPr>
-            </w:pPr>
-          </w:p>
-        </w:tc>
-      </w:tr>
-      <w:tr>
-        <w:tc>
-          <w:tcPr>
-            <w:tcW w:w="811" w:type="dxa"/>
-          </w:tcPr>
-          <w:p/>
-        </w:tc>
-        <w:tc>
-          <w:tcPr>
-            <w:tcW w:w="1639" w:type="dxa"/>
-          </w:tcPr>
-          <w:p/>
-        </w:tc>
-        <w:tc>
-          <w:tcPr>
-            <w:tcW w:w="4496" w:type="dxa"/>
-          </w:tcPr>
-          <w:p>
-            <w:pPr>
-              <w:rPr>
-                <w:noProof/>
-              </w:rPr>
-            </w:pPr>
-          </w:p>
-        </w:tc>
-        <w:tc>
-          <w:tcPr>
-            <w:tcW w:w="4820" w:type="dxa"/>
-          </w:tcPr>
-          <w:p/>
-        </w:tc>
-        <w:tc>
-          <w:tcPr>
-            <w:tcW w:w="4536" w:type="dxa"/>
-          </w:tcPr>
-          <w:p>
-            <w:pPr>
-              <w:rPr>
-                <w:noProof/>
-              </w:rPr>
-            </w:pPr>
+          <w:p>
+            <w:r>
+              <w:t>3/08/26</w:t>
+            </w:r>
+          </w:p>
+        </w:tc>
+        <w:tc>
+          <w:tcPr>
+            <w:tcW w:w="1639" w:type="dxa"/>
+          </w:tcPr>
+          <w:p>
+            <w:r>
+              <w:t xml:space="preserve">Stylistic additions </w:t>
+            </w:r>
+          </w:p>
+        </w:tc>
+        <w:tc>
+          <w:tcPr>
+            <w:tcW w:w="4496" w:type="dxa"/>
+          </w:tcPr>
+          <w:p>
+            <w:pPr>
+              <w:rPr>
+                <w:noProof/>
+              </w:rPr>
+            </w:pPr>
+          </w:p>
+          <w:p>
+            <w:pPr>
+              <w:rPr>
+                <w:noProof/>
+              </w:rPr>
+            </w:pPr>
+            <w:r>
+              <w:rPr>
+                <w:noProof/>
+              </w:rPr>
+              <w:drawing>
+                <wp:anchor distT="0" distB="0" distL="114300" distR="114300" simplePos="0" relativeHeight="251671552" behindDoc="0" locked="0" layoutInCell="1" allowOverlap="1" wp14:anchorId="5C6FBAD3" wp14:editId="73D4B972">
+                  <wp:simplePos x="0" y="0"/>
+                  <wp:positionH relativeFrom="column">
+                    <wp:posOffset>-1795</wp:posOffset>
+                  </wp:positionH>
+                  <wp:positionV relativeFrom="paragraph">
+                    <wp:posOffset>1601442</wp:posOffset>
+                  </wp:positionV>
+                  <wp:extent cx="1961515" cy="1979295"/>
+                  <wp:effectExtent l="0" t="0" r="635" b="1905"/>
+                  <wp:wrapSquare wrapText="bothSides"/>
+                  <wp:docPr id="2117195182" name="Picture 1"/>
+                  <wp:cNvGraphicFramePr>
+                    <a:graphicFrameLocks xmlns:a="http://schemas.openxmlformats.org/drawingml/2006/main" noChangeAspect="1"/>
+                  </wp:cNvGraphicFramePr>
+                  <a:graphic xmlns:a="http://schemas.openxmlformats.org/drawingml/2006/main">
+                    <a:graphicData uri="http://schemas.openxmlformats.org/drawingml/2006/picture">
+                      <pic:pic xmlns:pic="http://schemas.openxmlformats.org/drawingml/2006/picture">
+                        <pic:nvPicPr>
+                          <pic:cNvPr id="2117195182" name=""/>
+                          <pic:cNvPicPr/>
+                        </pic:nvPicPr>
+                        <pic:blipFill>
+                          <a:blip r:embed="rId10"/>
+                          <a:stretch>
+                            <a:fillRect/>
+                          </a:stretch>
+                        </pic:blipFill>
+                        <pic:spPr>
+                          <a:xfrm>
+                            <a:off x="0" y="0"/>
+                            <a:ext cx="1961515" cy="1979295"/>
+                          </a:xfrm>
+                          <a:prstGeom prst="rect">
+                            <a:avLst/>
+                          </a:prstGeom>
+                        </pic:spPr>
+                      </pic:pic>
+                    </a:graphicData>
+                  </a:graphic>
+                  <wp14:sizeRelH relativeFrom="margin">
+                    <wp14:pctWidth>0</wp14:pctWidth>
+                  </wp14:sizeRelH>
+                  <wp14:sizeRelV relativeFrom="margin">
+                    <wp14:pctHeight>0</wp14:pctHeight>
+                  </wp14:sizeRelV>
+                </wp:anchor>
+              </w:drawing>
+            </w:r>
+            <w:r>
+              <w:rPr>
+                <w:noProof/>
+              </w:rPr>
+              <w:drawing>
+                <wp:anchor distT="0" distB="0" distL="114300" distR="114300" simplePos="0" relativeHeight="251669504" behindDoc="0" locked="0" layoutInCell="1" allowOverlap="1" wp14:anchorId="6C26C9F8" wp14:editId="01CBA03A">
+                  <wp:simplePos x="0" y="0"/>
+                  <wp:positionH relativeFrom="column">
+                    <wp:posOffset>-64990</wp:posOffset>
+                  </wp:positionH>
+                  <wp:positionV relativeFrom="paragraph">
+                    <wp:posOffset>442</wp:posOffset>
+                  </wp:positionV>
+                  <wp:extent cx="2379980" cy="1423589"/>
+                  <wp:effectExtent l="0" t="0" r="1270" b="5715"/>
+                  <wp:wrapSquare wrapText="bothSides"/>
+                  <wp:docPr id="1055234874" name="Picture 1"/>
+                  <wp:cNvGraphicFramePr>
+                    <a:graphicFrameLocks xmlns:a="http://schemas.openxmlformats.org/drawingml/2006/main" noChangeAspect="1"/>
+                  </wp:cNvGraphicFramePr>
+                  <a:graphic xmlns:a="http://schemas.openxmlformats.org/drawingml/2006/main">
+                    <a:graphicData uri="http://schemas.openxmlformats.org/drawingml/2006/picture">
+                      <pic:pic xmlns:pic="http://schemas.openxmlformats.org/drawingml/2006/picture">
+                        <pic:nvPicPr>
+                          <pic:cNvPr id="1055234874" name=""/>
+                          <pic:cNvPicPr/>
+                        </pic:nvPicPr>
+                        <pic:blipFill>
+                          <a:blip r:embed="rId11"/>
+                          <a:stretch>
+                            <a:fillRect/>
+                          </a:stretch>
+                        </pic:blipFill>
+                        <pic:spPr>
+                          <a:xfrm>
+                            <a:off x="0" y="0"/>
+                            <a:ext cx="2380907" cy="1424143"/>
+                          </a:xfrm>
+                          <a:prstGeom prst="rect">
+                            <a:avLst/>
+                          </a:prstGeom>
+                        </pic:spPr>
+                      </pic:pic>
+                    </a:graphicData>
+                  </a:graphic>
+                  <wp14:sizeRelH relativeFrom="margin">
+                    <wp14:pctWidth>0</wp14:pctWidth>
+                  </wp14:sizeRelH>
+                  <wp14:sizeRelV relativeFrom="margin">
+                    <wp14:pctHeight>0</wp14:pctHeight>
+                  </wp14:sizeRelV>
+                </wp:anchor>
+              </w:drawing>
+            </w:r>
+          </w:p>
+        </w:tc>
+        <w:tc>
+          <w:tcPr>
+            <w:tcW w:w="4820" w:type="dxa"/>
+          </w:tcPr>
+          <w:p>
+            <w:r>
+              <w:t>I updated the colour schemes, I think this is a good change. I think the landing page especially looks really refined now.</w:t>
+            </w:r>
+          </w:p>
+        </w:tc>
+        <w:tc>
+          <w:tcPr>
+            <w:tcW w:w="4536" w:type="dxa"/>
+          </w:tcPr>
+          <w:p>
+            <w:pPr>
+              <w:rPr>
+                <w:noProof/>
+              </w:rPr>
+            </w:pPr>
+          </w:p>
+        </w:tc>
+      </w:tr>
+      <w:tr>
+        <w:tc>
+          <w:tcPr>
+            <w:tcW w:w="811" w:type="dxa"/>
+          </w:tcPr>
+          <w:p>
+            <w:r>
+              <w:t>3/08/26</w:t>
+            </w:r>
+          </w:p>
+        </w:tc>
+        <w:tc>
+          <w:tcPr>
+            <w:tcW w:w="1639" w:type="dxa"/>
+          </w:tcPr>
+          <w:p>
+            <w:r>
+              <w:t>Stylistic additions</w:t>
+            </w:r>
+          </w:p>
+        </w:tc>
+        <w:tc>
+          <w:tcPr>
+            <w:tcW w:w="4496" w:type="dxa"/>
+          </w:tcPr>
+          <w:p>
+            <w:pPr>
+              <w:rPr>
+                <w:noProof/>
+              </w:rPr>
+            </w:pPr>
+            <w:r>
+              <w:rPr>
+                <w:noProof/>
+              </w:rPr>
+              <w:drawing>
+                <wp:anchor distT="0" distB="0" distL="114300" distR="114300" simplePos="0" relativeHeight="251675648" behindDoc="0" locked="0" layoutInCell="1" allowOverlap="1" wp14:anchorId="507DF530" wp14:editId="48E5A759">
+                  <wp:simplePos x="0" y="0"/>
+                  <wp:positionH relativeFrom="column">
+                    <wp:posOffset>43897</wp:posOffset>
+                  </wp:positionH>
+                  <wp:positionV relativeFrom="paragraph">
+                    <wp:posOffset>48978</wp:posOffset>
+                  </wp:positionV>
+                  <wp:extent cx="1642745" cy="1113155"/>
+                  <wp:effectExtent l="0" t="0" r="0" b="0"/>
+                  <wp:wrapSquare wrapText="bothSides"/>
+                  <wp:docPr id="608812939" name="Picture 1"/>
+                  <wp:cNvGraphicFramePr>
+                    <a:graphicFrameLocks xmlns:a="http://schemas.openxmlformats.org/drawingml/2006/main" noChangeAspect="1"/>
+                  </wp:cNvGraphicFramePr>
+                  <a:graphic xmlns:a="http://schemas.openxmlformats.org/drawingml/2006/main">
+                    <a:graphicData uri="http://schemas.openxmlformats.org/drawingml/2006/picture">
+                      <pic:pic xmlns:pic="http://schemas.openxmlformats.org/drawingml/2006/picture">
+                        <pic:nvPicPr>
+                          <pic:cNvPr id="608812939" name=""/>
+                          <pic:cNvPicPr/>
+                        </pic:nvPicPr>
+                        <pic:blipFill>
+                          <a:blip r:embed="rId12"/>
+                          <a:stretch>
+                            <a:fillRect/>
+                          </a:stretch>
+                        </pic:blipFill>
+                        <pic:spPr>
+                          <a:xfrm>
+                            <a:off x="0" y="0"/>
+                            <a:ext cx="1642745" cy="1113155"/>
+                          </a:xfrm>
+                          <a:prstGeom prst="rect">
+                            <a:avLst/>
+                          </a:prstGeom>
+                        </pic:spPr>
+                      </pic:pic>
+                    </a:graphicData>
+                  </a:graphic>
+                  <wp14:sizeRelH relativeFrom="margin">
+                    <wp14:pctWidth>0</wp14:pctWidth>
+                  </wp14:sizeRelH>
+                  <wp14:sizeRelV relativeFrom="margin">
+                    <wp14:pctHeight>0</wp14:pctHeight>
+                  </wp14:sizeRelV>
+                </wp:anchor>
+              </w:drawing>
+            </w:r>
+          </w:p>
+        </w:tc>
+        <w:tc>
+          <w:tcPr>
+            <w:tcW w:w="4820" w:type="dxa"/>
+          </w:tcPr>
+          <w:p>
+            <w:r>
+              <w:t>I need a way for users to enter their name</w:t>
+            </w:r>
+            <w:r>
+              <w:t xml:space="preserve"> so that the system has a more personal touch. I will do this through a typing box and a send / enter button.</w:t>
+            </w:r>
+          </w:p>
+        </w:tc>
+        <w:tc>
+          <w:tcPr>
+            <w:tcW w:w="4536" w:type="dxa"/>
+          </w:tcPr>
+          <w:p>
+            <w:pPr>
+              <w:rPr>
+                <w:noProof/>
+              </w:rPr>
+            </w:pPr>
+            <w:r>
+              <w:rPr>
+                <w:noProof/>
+              </w:rPr>
+              <w:t xml:space="preserve">I will do this through some basic textarea code tutorial found at this website: </w:t>
+            </w:r>
+            <w:hyperlink r:id="rId13" w:history="1">
+              <w:r>
+                <w:rPr>
+                  <w:rStyle w:val="Hyperlink"/>
+                  <w:noProof/>
+                </w:rPr>
+                <w:t>HTML Text Box Code</w:t>
+              </w:r>
+            </w:hyperlink>
+          </w:p>
+          <w:p>
+            <w:pPr>
+              <w:rPr>
+                <w:noProof/>
+              </w:rPr>
+            </w:pPr>
+            <w:r>
+              <w:rPr>
+                <w:noProof/>
+              </w:rPr>
+              <w:drawing>
+                <wp:anchor distT="0" distB="0" distL="114300" distR="114300" simplePos="0" relativeHeight="251673600" behindDoc="0" locked="0" layoutInCell="1" allowOverlap="1" wp14:anchorId="60BE7CC8" wp14:editId="639106DD">
+                  <wp:simplePos x="0" y="0"/>
+                  <wp:positionH relativeFrom="column">
+                    <wp:posOffset>-64825</wp:posOffset>
+                  </wp:positionH>
+                  <wp:positionV relativeFrom="paragraph">
+                    <wp:posOffset>150605</wp:posOffset>
+                  </wp:positionV>
+                  <wp:extent cx="2081456" cy="294199"/>
+                  <wp:effectExtent l="0" t="0" r="0" b="0"/>
+                  <wp:wrapSquare wrapText="bothSides"/>
+                  <wp:docPr id="770263738" name="Picture 1"/>
+                  <wp:cNvGraphicFramePr>
+                    <a:graphicFrameLocks xmlns:a="http://schemas.openxmlformats.org/drawingml/2006/main" noChangeAspect="1"/>
+                  </wp:cNvGraphicFramePr>
+                  <a:graphic xmlns:a="http://schemas.openxmlformats.org/drawingml/2006/main">
+                    <a:graphicData uri="http://schemas.openxmlformats.org/drawingml/2006/picture">
+                      <pic:pic xmlns:pic="http://schemas.openxmlformats.org/drawingml/2006/picture">
+                        <pic:nvPicPr>
+                          <pic:cNvPr id="770263738" name=""/>
+                          <pic:cNvPicPr/>
+                        </pic:nvPicPr>
+                        <pic:blipFill>
+                          <a:blip r:embed="rId14"/>
+                          <a:stretch>
+                            <a:fillRect/>
+                          </a:stretch>
+                        </pic:blipFill>
+                        <pic:spPr>
+                          <a:xfrm>
+                            <a:off x="0" y="0"/>
+                            <a:ext cx="2129612" cy="301005"/>
+                          </a:xfrm>
+                          <a:prstGeom prst="rect">
+                            <a:avLst/>
+                          </a:prstGeom>
+                        </pic:spPr>
+                      </pic:pic>
+                    </a:graphicData>
+                  </a:graphic>
+                  <wp14:sizeRelH relativeFrom="margin">
+                    <wp14:pctWidth>0</wp14:pctWidth>
+                  </wp14:sizeRelH>
+                  <wp14:sizeRelV relativeFrom="margin">
+                    <wp14:pctHeight>0</wp14:pctHeight>
+                  </wp14:sizeRelV>
+                </wp:anchor>
+              </w:drawing>
+            </w:r>
+          </w:p>
+          <w:p>
+            <w:pPr>
+              <w:rPr>
+                <w:noProof/>
+              </w:rPr>
+            </w:pPr>
+          </w:p>
+          <w:p>
+            <w:pPr>
+              <w:rPr>
+                <w:noProof/>
+              </w:rPr>
+            </w:pPr>
+          </w:p>
+          <w:p>
+            <w:pPr>
+              <w:rPr>
+                <w:noProof/>
+              </w:rPr>
+            </w:pPr>
+          </w:p>
+        </w:tc>
+      </w:tr>
+      <w:tr>
+        <w:tc>
+          <w:tcPr>
+            <w:tcW w:w="811" w:type="dxa"/>
+          </w:tcPr>
+          <w:p>
+            <w:r>
+              <w:lastRenderedPageBreak/>
+              <w:t>3/08/26</w:t>
+            </w:r>
+          </w:p>
+        </w:tc>
+        <w:tc>
+          <w:tcPr>
+            <w:tcW w:w="1639" w:type="dxa"/>
+          </w:tcPr>
+          <w:p>
+            <w:r>
+              <w:t xml:space="preserve">Debug </w:t>
+            </w:r>
+          </w:p>
+        </w:tc>
+        <w:tc>
+          <w:tcPr>
+            <w:tcW w:w="4496" w:type="dxa"/>
+          </w:tcPr>
+          <w:p>
+            <w:pPr>
+              <w:rPr>
+                <w:noProof/>
+              </w:rPr>
+            </w:pPr>
+            <w:r>
+              <w:rPr>
+                <w:noProof/>
+              </w:rPr>
+              <w:drawing>
+                <wp:anchor distT="0" distB="0" distL="114300" distR="114300" simplePos="0" relativeHeight="251679744" behindDoc="0" locked="0" layoutInCell="1" allowOverlap="1" wp14:anchorId="57B2A291" wp14:editId="42D71D11">
+                  <wp:simplePos x="0" y="0"/>
+                  <wp:positionH relativeFrom="column">
+                    <wp:posOffset>-65405</wp:posOffset>
+                  </wp:positionH>
+                  <wp:positionV relativeFrom="paragraph">
+                    <wp:posOffset>1270</wp:posOffset>
+                  </wp:positionV>
+                  <wp:extent cx="1796415" cy="1992630"/>
+                  <wp:effectExtent l="0" t="0" r="0" b="7620"/>
+                  <wp:wrapSquare wrapText="bothSides"/>
+                  <wp:docPr id="535239333" name="Picture 1"/>
+                  <wp:cNvGraphicFramePr>
+                    <a:graphicFrameLocks xmlns:a="http://schemas.openxmlformats.org/drawingml/2006/main" noChangeAspect="1"/>
+                  </wp:cNvGraphicFramePr>
+                  <a:graphic xmlns:a="http://schemas.openxmlformats.org/drawingml/2006/main">
+                    <a:graphicData uri="http://schemas.openxmlformats.org/drawingml/2006/picture">
+                      <pic:pic xmlns:pic="http://schemas.openxmlformats.org/drawingml/2006/picture">
+                        <pic:nvPicPr>
+                          <pic:cNvPr id="535239333" name=""/>
+                          <pic:cNvPicPr/>
+                        </pic:nvPicPr>
+                        <pic:blipFill>
+                          <a:blip r:embed="rId15"/>
+                          <a:stretch>
+                            <a:fillRect/>
+                          </a:stretch>
+                        </pic:blipFill>
+                        <pic:spPr>
+                          <a:xfrm>
+                            <a:off x="0" y="0"/>
+                            <a:ext cx="1796415" cy="1992630"/>
+                          </a:xfrm>
+                          <a:prstGeom prst="rect">
+                            <a:avLst/>
+                          </a:prstGeom>
+                        </pic:spPr>
+                      </pic:pic>
+                    </a:graphicData>
+                  </a:graphic>
+                  <wp14:sizeRelH relativeFrom="margin">
+                    <wp14:pctWidth>0</wp14:pctWidth>
+                  </wp14:sizeRelH>
+                  <wp14:sizeRelV relativeFrom="margin">
+                    <wp14:pctHeight>0</wp14:pctHeight>
+                  </wp14:sizeRelV>
+                </wp:anchor>
+              </w:drawing>
+            </w:r>
+          </w:p>
+        </w:tc>
+        <w:tc>
+          <w:tcPr>
+            <w:tcW w:w="4820" w:type="dxa"/>
+          </w:tcPr>
+          <w:p>
+            <w:r>
+              <w:t>The Text box is not aligning to the centre of the page when I try to use align-items: centre;</w:t>
+            </w:r>
+          </w:p>
+          <w:p/>
+          <w:p/>
+        </w:tc>
+        <w:tc>
+          <w:tcPr>
+            <w:tcW w:w="4536" w:type="dxa"/>
+          </w:tcPr>
+          <w:p>
+            <w:pPr>
+              <w:rPr>
+                <w:noProof/>
+              </w:rPr>
+            </w:pPr>
+            <w:r>
+              <w:rPr>
+                <w:noProof/>
+              </w:rPr>
+              <w:t>I needed to add these four lines of code under home-shell rather than Namebox, because the name box is also under home-shell.</w:t>
+            </w:r>
+            <w:r>
+              <w:rPr>
+                <w:rFonts w:ascii="Public Sans Fallback" w:hAnsi="Public Sans Fallback"/>
+                <w:color w:val="131615"/>
+                <w:sz w:val="21"/>
+                <w:szCs w:val="21"/>
+                <w:shd w:val="clear" w:color="auto" w:fill="FFFFFF"/>
+              </w:rPr>
+              <w:t xml:space="preserve"> </w:t>
+            </w:r>
+            <w:r>
+              <w:rPr>
+                <w:noProof/>
+              </w:rPr>
+              <w:t xml:space="preserve">I made some changes to the layout so that the main content is now centered on the page, rather than being stuck too high up or following the usual flow of the document. This gives it a neater look. I also tidied up the container to make it look more streamlined and kept the spacing consistent, which makes the page feel more polished. </w:t>
+            </w:r>
+            <w:r>
+              <w:rPr>
+                <w:noProof/>
+              </w:rPr>
+              <w:t>T</w:t>
+            </w:r>
+            <w:r>
+              <w:rPr>
+                <w:noProof/>
+              </w:rPr>
+              <w:t>he headings and content blocks look more organized and the whole page is easier to read and more balanced.</w:t>
+            </w:r>
+          </w:p>
+          <w:p>
+            <w:pPr>
+              <w:rPr>
+                <w:noProof/>
+              </w:rPr>
+            </w:pPr>
+            <w:r>
+              <w:rPr>
+                <w:noProof/>
+              </w:rPr>
+              <w:drawing>
+                <wp:anchor distT="0" distB="0" distL="114300" distR="114300" simplePos="0" relativeHeight="251681792" behindDoc="0" locked="0" layoutInCell="1" allowOverlap="1" wp14:anchorId="250AADAC" wp14:editId="0A335AC6">
+                  <wp:simplePos x="0" y="0"/>
+                  <wp:positionH relativeFrom="column">
+                    <wp:posOffset>8973</wp:posOffset>
+                  </wp:positionH>
+                  <wp:positionV relativeFrom="paragraph">
+                    <wp:posOffset>1586810</wp:posOffset>
+                  </wp:positionV>
+                  <wp:extent cx="2004060" cy="1654175"/>
+                  <wp:effectExtent l="0" t="0" r="0" b="3175"/>
+                  <wp:wrapSquare wrapText="bothSides"/>
+                  <wp:docPr id="492317545" name="Picture 1"/>
+                  <wp:cNvGraphicFramePr>
+                    <a:graphicFrameLocks xmlns:a="http://schemas.openxmlformats.org/drawingml/2006/main" noChangeAspect="1"/>
+                  </wp:cNvGraphicFramePr>
+                  <a:graphic xmlns:a="http://schemas.openxmlformats.org/drawingml/2006/main">
+                    <a:graphicData uri="http://schemas.openxmlformats.org/drawingml/2006/picture">
+                      <pic:pic xmlns:pic="http://schemas.openxmlformats.org/drawingml/2006/picture">
+                        <pic:nvPicPr>
+                          <pic:cNvPr id="492317545" name=""/>
+                          <pic:cNvPicPr/>
+                        </pic:nvPicPr>
+                        <pic:blipFill>
+                          <a:blip r:embed="rId16"/>
+                          <a:stretch>
+                            <a:fillRect/>
+                          </a:stretch>
+                        </pic:blipFill>
+                        <pic:spPr>
+                          <a:xfrm>
+                            <a:off x="0" y="0"/>
+                            <a:ext cx="2004060" cy="1654175"/>
+                          </a:xfrm>
+                          <a:prstGeom prst="rect">
+                            <a:avLst/>
+                          </a:prstGeom>
+                        </pic:spPr>
+                      </pic:pic>
+                    </a:graphicData>
+                  </a:graphic>
+                  <wp14:sizeRelH relativeFrom="margin">
+                    <wp14:pctWidth>0</wp14:pctWidth>
+                  </wp14:sizeRelH>
+                  <wp14:sizeRelV relativeFrom="margin">
+                    <wp14:pctHeight>0</wp14:pctHeight>
+                  </wp14:sizeRelV>
+                </wp:anchor>
+              </w:drawing>
+            </w:r>
+            <w:r>
+              <w:rPr>
+                <w:noProof/>
+              </w:rPr>
+              <w:drawing>
+                <wp:anchor distT="0" distB="0" distL="114300" distR="114300" simplePos="0" relativeHeight="251677696" behindDoc="0" locked="0" layoutInCell="1" allowOverlap="1" wp14:anchorId="09720FCF" wp14:editId="2D1A9F7F">
+                  <wp:simplePos x="0" y="0"/>
+                  <wp:positionH relativeFrom="column">
+                    <wp:posOffset>48647</wp:posOffset>
+                  </wp:positionH>
+                  <wp:positionV relativeFrom="paragraph">
+                    <wp:posOffset>9221</wp:posOffset>
+                  </wp:positionV>
+                  <wp:extent cx="1973580" cy="1504950"/>
+                  <wp:effectExtent l="0" t="0" r="7620" b="0"/>
+                  <wp:wrapSquare wrapText="bothSides"/>
+                  <wp:docPr id="764724092" name="Picture 1"/>
+                  <wp:cNvGraphicFramePr>
+                    <a:graphicFrameLocks xmlns:a="http://schemas.openxmlformats.org/drawingml/2006/main" noChangeAspect="1"/>
+                  </wp:cNvGraphicFramePr>
+                  <a:graphic xmlns:a="http://schemas.openxmlformats.org/drawingml/2006/main">
+                    <a:graphicData uri="http://schemas.openxmlformats.org/drawingml/2006/picture">
+                      <pic:pic xmlns:pic="http://schemas.openxmlformats.org/drawingml/2006/picture">
+                        <pic:nvPicPr>
+                          <pic:cNvPr id="764724092" name=""/>
+                          <pic:cNvPicPr/>
+                        </pic:nvPicPr>
+                        <pic:blipFill>
+                          <a:blip r:embed="rId17"/>
+                          <a:stretch>
+                            <a:fillRect/>
+                          </a:stretch>
+                        </pic:blipFill>
+                        <pic:spPr>
+                          <a:xfrm>
+                            <a:off x="0" y="0"/>
+                            <a:ext cx="1973580" cy="1504950"/>
+                          </a:xfrm>
+                          <a:prstGeom prst="rect">
+                            <a:avLst/>
+                          </a:prstGeom>
+                        </pic:spPr>
+                      </pic:pic>
+                    </a:graphicData>
+                  </a:graphic>
+                  <wp14:sizeRelH relativeFrom="margin">
+                    <wp14:pctWidth>0</wp14:pctWidth>
+                  </wp14:sizeRelH>
+                  <wp14:sizeRelV relativeFrom="margin">
+                    <wp14:pctHeight>0</wp14:pctHeight>
+                  </wp14:sizeRelV>
+                </wp:anchor>
+              </w:drawing>
+            </w:r>
           </w:p>
         </w:tc>
       </w:tr>
@@ -3599,7 +4110,6 @@
   <w:style w:type="character" w:default="1" w:styleId="DefaultParagraphFont">
     <w:name w:val="Default Paragraph Font"/>
     <w:uiPriority w:val="1"/>
-    <w:semiHidden/>
     <w:unhideWhenUsed/>
   </w:style>
   <w:style w:type="table" w:default="1" w:styleId="TableNormal">

</xml_diff>